<commit_message>
Resolution signature sheet: turn 'no objection' item into a confirmation request
Co-Authored-By: Claude Opus 5.5 <noreply@anthropic.com>
Claude-Session: https://claude.ai/code/session_01H9b7FFp3sXnkbpWqGcr2Bw
</commit_message>
<xml_diff>
--- a/4개마을_주민결의서명부.docx
+++ b/4개마을_주민결의서명부.docx
@@ -94,7 +94,7 @@
                 <w:sz w:val="19"/>
                 <w:szCs w:val="19"/>
               </w:rPr>
-              <w:t xml:space="preserve">2022~2023년 문서에서 감곡면 환경개선위원회와 각 마을 이장은 "5개 부락 협의체를 대표하는 위원장에게 위임", "5개 마을을 대표해서", "○○마을이장" 직함 서명 등 마을 대표 자격으로 순정축협과 협약을 맺었습니다. 2023. 5. 2. 위원회 회의록에는 "순정축협에서 받은 돈을 마을별로 1천만 원씩 나눠주자는 의견"과 순정축협 조합장을 위원회 임원으로 추천한 내용이 있고, 이튿날 순정축협은 퇴비사 약 300평의 신축허가를 신청하였으며, 2023. 7. 20. "반대 의견 없음" 의견서가 제출되었습니다. 그런데 2026. 9. 위원회와 순정축협은 위원회를 "자발적 주민공동체"라고 하며 순정축협이 밝힌 1억 원의 지급·사용 내역 공개를 거부하고 있습니다. 이에 주민 각자가 아래 결의 내용에 동의함을 서명으로 밝힙니다.</w:t>
+              <w:t xml:space="preserve">2022~2023년 문서에서 감곡면 환경개선위원회와 각 마을 이장은 "5개 부락 협의체를 대표하는 위원장에게 위임", "5개 마을을 대표해서", "○○마을이장" 직함 서명 등 마을 대표 자격으로 순정축협과 협약을 맺었습니다. 2023. 5. 2. 위원회 회의록에는 "순정축협에서 받은 돈을 마을별로 1천만 원씩 나눠주자는 의견"과 순정축협 조합장을 위원회 임원으로 추천한 내용이 있고, 이튿날 순정축협은 퇴비사 약 300평의 신축허가를 신청하였고, 2023. 7. 20. 제출인이 가려진 "반대 의견 없음" 의견서가 제출되었습니다. 그런데 2026. 9. 위원회와 순정축협은 위원회를 "자발적 주민공동체"라고 하며 순정축협이 밝힌 1억 원의 지급·사용 내역 공개를 거부하고 있습니다. 이에 주민 각자가 아래 결의 내용에 동의함을 서명으로 밝힙니다.</w:t>
             </w:r>
           </w:p>
         </w:tc>
@@ -247,7 +247,7 @@
           <w:sz w:val="18"/>
           <w:szCs w:val="18"/>
         </w:rPr>
-        <w:t xml:space="preserve">② 결의 내용(마을별 쪽의 1~7항)을 </w:t>
+        <w:t xml:space="preserve">② 결의 내용(마을별 쪽의 1~8항)을 </w:t>
       </w:r>
       <w:r>
         <w:rPr>
@@ -460,7 +460,7 @@
                 <w:sz w:val="19"/>
                 <w:szCs w:val="19"/>
               </w:rPr>
-              <w:t xml:space="preserve"> ① 2023. 1. 30. 공동협약 체결 ② 순정축협으로부터의 금원(운영비 후원·환경개선사업비 등, 순정축협이 밝힌 1억 원 포함) 수령과 그 사용 결정 ③ 2023. 7. 20. 순정축협 퇴비사 997.5㎡(약 300평) 신축에 관한 "반대 의견 없음" 의견 중 본 마을 명의로 이루어진 부분 ④ 2023. 5. 2. 위원회 회의에서 마을 이장을 위원회 법인 임원으로 정한 결의 중 본 마을 대표 자격에 관한 부분. 이 서명은 본인이 개별적으로 가지는 손해배상청구권 등 권리를 포기하는 것이 아닙니다.</w:t>
+              <w:t xml:space="preserve"> ① 2023. 1. 30. 공동협약 체결 ② 순정축협으로부터의 금원(운영비 후원·환경개선사업비 등, 순정축협이 밝힌 1억 원 포함) 수령과 그 사용 결정 ③ 2023. 5. 2. 위원회 회의에서 마을 이장을 위원회 법인 임원으로 정한 결의 중 본 마을 대표 자격에 관한 부분. 이 서명은 본인이 개별적으로 가지는 손해배상청구권 등 권리를 포기하는 것이 아닙니다.</w:t>
             </w:r>
           </w:p>
           <w:p>
@@ -477,15 +477,69 @@
                 <w:sz w:val="19"/>
                 <w:szCs w:val="19"/>
               </w:rPr>
-              <w:t xml:space="preserve">3. (자료 공개 요구)</w:t>
-            </w:r>
-            <w:r>
-              <w:rPr>
-                <w:rFonts w:ascii="맑은 고딕" w:cs="맑은 고딕" w:eastAsia="맑은 고딕" w:hAnsi="맑은 고딕"/>
-                <w:sz w:val="19"/>
-                <w:szCs w:val="19"/>
-              </w:rPr>
-              <w:t xml:space="preserve"> 본인은 감곡면 환경개선위원회와 순정축산업협동조합에 다음 자료의 공개와 보고를 요구합니다. ① 1억 원(및 그 밖의 지원금)의 지급 결의, 지급일, 수령 계좌 명의 ② 위원회의 금원 사용 내역과 증빙, 현재 잔액 ③ 위원회 규약, 위원 명단, 제1차부터 그 이후의 회의록 ④ 순정축협이 약속한 분기별 검사자료 ⑤ 2023. 7. 20. 주민의견서의 제출인과 제출 경위 (개인 계좌번호·연락처 등은 가리고 공개하여도 됩니다.)</w:t>
+              <w:t xml:space="preserve">3. ("반대 의견 없음" 서명 확인)</w:t>
+            </w:r>
+            <w:r>
+              <w:rPr>
+                <w:rFonts w:ascii="맑은 고딕" w:cs="맑은 고딕" w:eastAsia="맑은 고딕" w:hAnsi="맑은 고딕"/>
+                <w:sz w:val="19"/>
+                <w:szCs w:val="19"/>
+              </w:rPr>
+              <w:t xml:space="preserve"> 순정축협이 2023. 5. 3. 신축허가를 신청한 퇴비사 997.5㎡(약 300평)에 관하여, 감곡면장이 2023. 7. 21. 정읍시에 제출한 2023. 7. 20.자 주민의견서에는 </w:t>
+            </w:r>
+            <w:r>
+              <w:rPr>
+                <w:rFonts w:ascii="맑은 고딕" w:cs="맑은 고딕" w:eastAsia="맑은 고딕" w:hAnsi="맑은 고딕"/>
+                <w:b/>
+                <w:bCs/>
+                <w:sz w:val="19"/>
+                <w:szCs w:val="19"/>
+              </w:rPr>
+              <w:t xml:space="preserve">"반대 의견 없음"</w:t>
+            </w:r>
+            <w:r>
+              <w:rPr>
+                <w:rFonts w:ascii="맑은 고딕" w:cs="맑은 고딕" w:eastAsia="맑은 고딕" w:hAnsi="맑은 고딕"/>
+                <w:sz w:val="19"/>
+                <w:szCs w:val="19"/>
+              </w:rPr>
+              <w:t xml:space="preserve">이라고 적혀 있으나 의견제출인은 가려져 있습니다. 본인은 위 의견 제출에 관하여 </w:t>
+            </w:r>
+            <w:r>
+              <w:rPr>
+                <w:rFonts w:ascii="맑은 고딕" w:cs="맑은 고딕" w:eastAsia="맑은 고딕" w:hAnsi="맑은 고딕"/>
+                <w:b/>
+                <w:bCs/>
+                <w:sz w:val="19"/>
+                <w:szCs w:val="19"/>
+              </w:rPr>
+              <w:t xml:space="preserve">의견을 묻거나 통지받은 사실이 없습니다.</w:t>
+            </w:r>
+            <w:r>
+              <w:rPr>
+                <w:rFonts w:ascii="맑은 고딕" w:cs="맑은 고딕" w:eastAsia="맑은 고딕" w:hAnsi="맑은 고딕"/>
+                <w:sz w:val="19"/>
+                <w:szCs w:val="19"/>
+              </w:rPr>
+              <w:t xml:space="preserve"> 이에 본인은 </w:t>
+            </w:r>
+            <w:r>
+              <w:rPr>
+                <w:rFonts w:ascii="맑은 고딕" w:cs="맑은 고딕" w:eastAsia="맑은 고딕" w:hAnsi="맑은 고딕"/>
+                <w:b/>
+                <w:bCs/>
+                <w:sz w:val="19"/>
+                <w:szCs w:val="19"/>
+              </w:rPr>
+              <w:t xml:space="preserve">당시 동곡마을 이장 강길호 및 감곡면 환경개선위원회 위원들이 위 "반대 의견 없음" 의견서에 서명한 사실이 있는지, 있다면 누가 어떤 자격으로 서명하였는지 밝혀 줄 것을 요구합니다.</w:t>
+            </w:r>
+            <w:r>
+              <w:rPr>
+                <w:rFonts w:ascii="맑은 고딕" w:cs="맑은 고딕" w:eastAsia="맑은 고딕" w:hAnsi="맑은 고딕"/>
+                <w:sz w:val="19"/>
+                <w:szCs w:val="19"/>
+              </w:rPr>
+              <w:t xml:space="preserve"> 서명한 사실이 있다면, 본인은 그 의견이 동곡마을 주민의 의견으로 취급되는 것을 추인하지 않습니다.</w:t>
             </w:r>
           </w:p>
           <w:p>
@@ -502,33 +556,15 @@
                 <w:sz w:val="19"/>
                 <w:szCs w:val="19"/>
               </w:rPr>
-              <w:t xml:space="preserve">4. (수사의뢰 동참)</w:t>
-            </w:r>
-            <w:r>
-              <w:rPr>
-                <w:rFonts w:ascii="맑은 고딕" w:cs="맑은 고딕" w:eastAsia="맑은 고딕" w:hAnsi="맑은 고딕"/>
-                <w:sz w:val="19"/>
-                <w:szCs w:val="19"/>
-              </w:rPr>
-              <w:t xml:space="preserve"> 본인은 위 금원의 지급 경위와 사용처를 밝히기 위하여 감곡면 횡룡마을 주민 박상남이 정읍경찰서에 제출하는 </w:t>
-            </w:r>
-            <w:r>
-              <w:rPr>
-                <w:rFonts w:ascii="맑은 고딕" w:cs="맑은 고딕" w:eastAsia="맑은 고딕" w:hAnsi="맑은 고딕"/>
-                <w:b/>
-                <w:bCs/>
-                <w:sz w:val="19"/>
-                <w:szCs w:val="19"/>
-              </w:rPr>
-              <w:t xml:space="preserve">수사의뢰 진정에 동참</w:t>
-            </w:r>
-            <w:r>
-              <w:rPr>
-                <w:rFonts w:ascii="맑은 고딕" w:cs="맑은 고딕" w:eastAsia="맑은 고딕" w:hAnsi="맑은 고딕"/>
-                <w:sz w:val="19"/>
-                <w:szCs w:val="19"/>
-              </w:rPr>
-              <w:t xml:space="preserve">하며, 이 서명부가 그 첨부자료로 제출되는 데 동의합니다. 이 서명은 특정인의 범죄를 단정하는 것이 아니라 사실 확인을 요청하는 것입니다.</w:t>
+              <w:t xml:space="preserve">4. (자료 공개 요구)</w:t>
+            </w:r>
+            <w:r>
+              <w:rPr>
+                <w:rFonts w:ascii="맑은 고딕" w:cs="맑은 고딕" w:eastAsia="맑은 고딕" w:hAnsi="맑은 고딕"/>
+                <w:sz w:val="19"/>
+                <w:szCs w:val="19"/>
+              </w:rPr>
+              <w:t xml:space="preserve"> 본인은 감곡면 환경개선위원회와 순정축산업협동조합에 다음 자료의 공개와 보고를 요구합니다. ① 1억 원(및 그 밖의 지원금)의 지급 결의, 지급일, 수령 계좌 명의 ② 위원회의 금원 사용 내역과 증빙, 현재 잔액 ③ 위원회 규약, 위원 명단, 제1차부터 그 이후의 회의록 ④ 순정축협이 약속한 분기별 검사자료 ⑤ 2023. 7. 20. 주민의견서의 제출인과 제출 경위 (개인 계좌번호·연락처 등은 가리고 공개하여도 됩니다.)</w:t>
             </w:r>
           </w:p>
           <w:p>
@@ -545,15 +581,33 @@
                 <w:sz w:val="19"/>
                 <w:szCs w:val="19"/>
               </w:rPr>
-              <w:t xml:space="preserve">5. (연락·제출 위임)</w:t>
-            </w:r>
-            <w:r>
-              <w:rPr>
-                <w:rFonts w:ascii="맑은 고딕" w:cs="맑은 고딕" w:eastAsia="맑은 고딕" w:hAnsi="맑은 고딕"/>
-                <w:sz w:val="19"/>
-                <w:szCs w:val="19"/>
-              </w:rPr>
-              <w:t xml:space="preserve"> 본인은 위 3·4항의 요구와 진정 동참에 필요한 연락, 서명부 제출, 관계기관 민원 제기를 서명 수합 책임자 박상남에게 맡깁니다.</w:t>
+              <w:t xml:space="preserve">5. (수사의뢰 동참)</w:t>
+            </w:r>
+            <w:r>
+              <w:rPr>
+                <w:rFonts w:ascii="맑은 고딕" w:cs="맑은 고딕" w:eastAsia="맑은 고딕" w:hAnsi="맑은 고딕"/>
+                <w:sz w:val="19"/>
+                <w:szCs w:val="19"/>
+              </w:rPr>
+              <w:t xml:space="preserve"> 본인은 위 금원의 지급 경위와 사용처를 밝히기 위하여 감곡면 횡룡마을 주민 박상남이 정읍경찰서에 제출하는 </w:t>
+            </w:r>
+            <w:r>
+              <w:rPr>
+                <w:rFonts w:ascii="맑은 고딕" w:cs="맑은 고딕" w:eastAsia="맑은 고딕" w:hAnsi="맑은 고딕"/>
+                <w:b/>
+                <w:bCs/>
+                <w:sz w:val="19"/>
+                <w:szCs w:val="19"/>
+              </w:rPr>
+              <w:t xml:space="preserve">수사의뢰 진정에 동참</w:t>
+            </w:r>
+            <w:r>
+              <w:rPr>
+                <w:rFonts w:ascii="맑은 고딕" w:cs="맑은 고딕" w:eastAsia="맑은 고딕" w:hAnsi="맑은 고딕"/>
+                <w:sz w:val="19"/>
+                <w:szCs w:val="19"/>
+              </w:rPr>
+              <w:t xml:space="preserve">하며, 이 서명부가 그 첨부자료로 제출되는 데 동의합니다. 이 서명은 특정인의 범죄를 단정하는 것이 아니라 사실 확인을 요청하는 것입니다.</w:t>
             </w:r>
           </w:p>
           <w:p>
@@ -570,33 +624,15 @@
                 <w:sz w:val="19"/>
                 <w:szCs w:val="19"/>
               </w:rPr>
-              <w:t xml:space="preserve">6. (향후 원칙)</w:t>
-            </w:r>
-            <w:r>
-              <w:rPr>
-                <w:rFonts w:ascii="맑은 고딕" w:cs="맑은 고딕" w:eastAsia="맑은 고딕" w:hAnsi="맑은 고딕"/>
-                <w:sz w:val="19"/>
-                <w:szCs w:val="19"/>
-              </w:rPr>
-              <w:t xml:space="preserve"> 본인은 앞으로 동곡마을의 이름으로 외부 단체·사업자와 협약을 맺거나, 행정기관에 마을 의견을 제출하거나, 금원을 받는 경우에는 </w:t>
-            </w:r>
-            <w:r>
-              <w:rPr>
-                <w:rFonts w:ascii="맑은 고딕" w:cs="맑은 고딕" w:eastAsia="맑은 고딕" w:hAnsi="맑은 고딕"/>
-                <w:b/>
-                <w:bCs/>
-                <w:sz w:val="19"/>
-                <w:szCs w:val="19"/>
-              </w:rPr>
-              <w:t xml:space="preserve">반드시 사전에 마을총회의 결의</w:t>
-            </w:r>
-            <w:r>
-              <w:rPr>
-                <w:rFonts w:ascii="맑은 고딕" w:cs="맑은 고딕" w:eastAsia="맑은 고딕" w:hAnsi="맑은 고딕"/>
-                <w:sz w:val="19"/>
-                <w:szCs w:val="19"/>
-              </w:rPr>
-              <w:t xml:space="preserve">를 거쳐야 한다고 봅니다. 감곡면 환경개선위원회는 그러한 결의가 있기 전까지 본인을 포함한 동곡마을 주민 전체를 대표하지 않습니다.</w:t>
+              <w:t xml:space="preserve">6. (연락·제출 위임)</w:t>
+            </w:r>
+            <w:r>
+              <w:rPr>
+                <w:rFonts w:ascii="맑은 고딕" w:cs="맑은 고딕" w:eastAsia="맑은 고딕" w:hAnsi="맑은 고딕"/>
+                <w:sz w:val="19"/>
+                <w:szCs w:val="19"/>
+              </w:rPr>
+              <w:t xml:space="preserve"> 본인은 위 3~5항의 요구와 진정 동참에 필요한 연락, 서명부 제출, 관계기관 민원 제기를 서명 수합 책임자 박상남에게 맡깁니다.</w:t>
             </w:r>
           </w:p>
           <w:p>
@@ -613,7 +649,50 @@
                 <w:sz w:val="19"/>
                 <w:szCs w:val="19"/>
               </w:rPr>
-              <w:t xml:space="preserve">7. (사본 송부 동의)</w:t>
+              <w:t xml:space="preserve">7. (향후 원칙)</w:t>
+            </w:r>
+            <w:r>
+              <w:rPr>
+                <w:rFonts w:ascii="맑은 고딕" w:cs="맑은 고딕" w:eastAsia="맑은 고딕" w:hAnsi="맑은 고딕"/>
+                <w:sz w:val="19"/>
+                <w:szCs w:val="19"/>
+              </w:rPr>
+              <w:t xml:space="preserve"> 본인은 앞으로 동곡마을의 이름으로 외부 단체·사업자와 협약을 맺거나, 행정기관에 마을 의견을 제출하거나, 금원을 받는 경우에는 </w:t>
+            </w:r>
+            <w:r>
+              <w:rPr>
+                <w:rFonts w:ascii="맑은 고딕" w:cs="맑은 고딕" w:eastAsia="맑은 고딕" w:hAnsi="맑은 고딕"/>
+                <w:b/>
+                <w:bCs/>
+                <w:sz w:val="19"/>
+                <w:szCs w:val="19"/>
+              </w:rPr>
+              <w:t xml:space="preserve">반드시 사전에 마을총회의 결의</w:t>
+            </w:r>
+            <w:r>
+              <w:rPr>
+                <w:rFonts w:ascii="맑은 고딕" w:cs="맑은 고딕" w:eastAsia="맑은 고딕" w:hAnsi="맑은 고딕"/>
+                <w:sz w:val="19"/>
+                <w:szCs w:val="19"/>
+              </w:rPr>
+              <w:t xml:space="preserve">를 거쳐야 한다고 봅니다. 감곡면 환경개선위원회는 그러한 결의가 있기 전까지 본인을 포함한 동곡마을 주민 전체를 대표하지 않습니다.</w:t>
+            </w:r>
+          </w:p>
+          <w:p>
+            <w:pPr>
+              <w:spacing w:after="40" w:before="0" w:line="280"/>
+              <w:ind w:left="340" w:hanging="340"/>
+              <w:jc w:val="both"/>
+            </w:pPr>
+            <w:r>
+              <w:rPr>
+                <w:rFonts w:ascii="맑은 고딕" w:cs="맑은 고딕" w:eastAsia="맑은 고딕" w:hAnsi="맑은 고딕"/>
+                <w:b/>
+                <w:bCs/>
+                <w:sz w:val="19"/>
+                <w:szCs w:val="19"/>
+              </w:rPr>
+              <w:t xml:space="preserve">8. (사본 송부 동의)</w:t>
             </w:r>
             <w:r>
               <w:rPr>
@@ -702,7 +781,7 @@
                 <w:sz w:val="17"/>
                 <w:szCs w:val="17"/>
               </w:rPr>
-              <w:t xml:space="preserve"> 본인은 앞쪽 1~7항에 동의합니다: ① 2023. 1. 30. 공동협약에 당시 동곡마을 이장 강길호이(가) 서명할 때 마을총회 결의나 본인의 위임을 알지 못하고 참여·통지받은 사실이 없음 ② 이장·위원회가 동곡마을 주민을 대표하여 한 협약 체결, 1억 원 등 금원 수령·사용, 퇴비사 신축 "반대 의견 없음" 의견 제출 등을 </w:t>
+              <w:t xml:space="preserve"> 본인은 앞쪽 1~8항에 동의합니다: ① 2023. 1. 30. 공동협약에 당시 동곡마을 이장 강길호이(가) 서명할 때 마을총회 결의나 본인의 위임을 알지 못하고 참여·통지받은 사실이 없음 ② 이장·위원회가 동곡마을 주민을 대표하여 한 협약 체결, 1억 원 등 금원 수령·사용 등을 </w:t>
             </w:r>
             <w:r>
               <w:rPr>
@@ -720,7 +799,7 @@
                 <w:sz w:val="17"/>
                 <w:szCs w:val="17"/>
               </w:rPr>
-              <w:t xml:space="preserve"> ③ 위원회·순정축협에 자료 공개·보고 요구 ④ </w:t>
+              <w:t xml:space="preserve"> ③ </w:t>
             </w:r>
             <w:r>
               <w:rPr>
@@ -730,7 +809,7 @@
                 <w:sz w:val="17"/>
                 <w:szCs w:val="17"/>
               </w:rPr>
-              <w:t xml:space="preserve">수사의뢰 진정 동참</w:t>
+              <w:t xml:space="preserve">퇴비사 신축 "반대 의견 없음" 의견서에 이장·위원회가 서명한 사실이 있는지 밝힐 것을 요구</w:t>
             </w:r>
             <w:r>
               <w:rPr>
@@ -738,7 +817,25 @@
                 <w:sz w:val="17"/>
                 <w:szCs w:val="17"/>
               </w:rPr>
-              <w:t xml:space="preserve"> ⑤ 연락·제출을 박상남에게 맡김 ⑥ 마을 이름의 대표 행위는 마을총회 결의 필요 ⑦ 사본 송부·원본 제출과 개인정보 이용에 동의</w:t>
+              <w:t xml:space="preserve">(서명했다면 주민 의견으로 추인하지 않음) ④ 위원회·순정축협에 자료 공개·보고 요구 ⑤ </w:t>
+            </w:r>
+            <w:r>
+              <w:rPr>
+                <w:rFonts w:ascii="맑은 고딕" w:cs="맑은 고딕" w:eastAsia="맑은 고딕" w:hAnsi="맑은 고딕"/>
+                <w:b/>
+                <w:bCs/>
+                <w:sz w:val="17"/>
+                <w:szCs w:val="17"/>
+              </w:rPr>
+              <w:t xml:space="preserve">수사의뢰 진정 동참</w:t>
+            </w:r>
+            <w:r>
+              <w:rPr>
+                <w:rFonts w:ascii="맑은 고딕" w:cs="맑은 고딕" w:eastAsia="맑은 고딕" w:hAnsi="맑은 고딕"/>
+                <w:sz w:val="17"/>
+                <w:szCs w:val="17"/>
+              </w:rPr>
+              <w:t xml:space="preserve"> ⑥ 연락·제출을 박상남에게 맡김 ⑦ 마을 이름의 대표 행위는 마을총회 결의 필요 ⑧ 사본 송부·원본 제출과 개인정보 이용에 동의</w:t>
             </w:r>
           </w:p>
         </w:tc>
@@ -3282,7 +3379,7 @@
                 <w:sz w:val="19"/>
                 <w:szCs w:val="19"/>
               </w:rPr>
-              <w:t xml:space="preserve"> ① 2023. 1. 30. 공동협약 체결 ② 순정축협으로부터의 금원(운영비 후원·환경개선사업비 등, 순정축협이 밝힌 1억 원 포함) 수령과 그 사용 결정 ③ 2023. 7. 20. 순정축협 퇴비사 997.5㎡(약 300평) 신축에 관한 "반대 의견 없음" 의견 중 본 마을 명의로 이루어진 부분 ④ 2023. 5. 2. 위원회 회의에서 마을 이장을 위원회 법인 임원으로 정한 결의 중 본 마을 대표 자격에 관한 부분. 이 서명은 본인이 개별적으로 가지는 손해배상청구권 등 권리를 포기하는 것이 아닙니다.</w:t>
+              <w:t xml:space="preserve"> ① 2023. 1. 30. 공동협약 체결 ② 순정축협으로부터의 금원(운영비 후원·환경개선사업비 등, 순정축협이 밝힌 1억 원 포함) 수령과 그 사용 결정 ③ 2023. 5. 2. 위원회 회의에서 마을 이장을 위원회 법인 임원으로 정한 결의 중 본 마을 대표 자격에 관한 부분. 이 서명은 본인이 개별적으로 가지는 손해배상청구권 등 권리를 포기하는 것이 아닙니다.</w:t>
             </w:r>
           </w:p>
           <w:p>
@@ -3299,15 +3396,69 @@
                 <w:sz w:val="19"/>
                 <w:szCs w:val="19"/>
               </w:rPr>
-              <w:t xml:space="preserve">3. (자료 공개 요구)</w:t>
-            </w:r>
-            <w:r>
-              <w:rPr>
-                <w:rFonts w:ascii="맑은 고딕" w:cs="맑은 고딕" w:eastAsia="맑은 고딕" w:hAnsi="맑은 고딕"/>
-                <w:sz w:val="19"/>
-                <w:szCs w:val="19"/>
-              </w:rPr>
-              <w:t xml:space="preserve"> 본인은 감곡면 환경개선위원회와 순정축산업협동조합에 다음 자료의 공개와 보고를 요구합니다. ① 1억 원(및 그 밖의 지원금)의 지급 결의, 지급일, 수령 계좌 명의 ② 위원회의 금원 사용 내역과 증빙, 현재 잔액 ③ 위원회 규약, 위원 명단, 제1차부터 그 이후의 회의록 ④ 순정축협이 약속한 분기별 검사자료 ⑤ 2023. 7. 20. 주민의견서의 제출인과 제출 경위 (개인 계좌번호·연락처 등은 가리고 공개하여도 됩니다.)</w:t>
+              <w:t xml:space="preserve">3. ("반대 의견 없음" 서명 확인)</w:t>
+            </w:r>
+            <w:r>
+              <w:rPr>
+                <w:rFonts w:ascii="맑은 고딕" w:cs="맑은 고딕" w:eastAsia="맑은 고딕" w:hAnsi="맑은 고딕"/>
+                <w:sz w:val="19"/>
+                <w:szCs w:val="19"/>
+              </w:rPr>
+              <w:t xml:space="preserve"> 순정축협이 2023. 5. 3. 신축허가를 신청한 퇴비사 997.5㎡(약 300평)에 관하여, 감곡면장이 2023. 7. 21. 정읍시에 제출한 2023. 7. 20.자 주민의견서에는 </w:t>
+            </w:r>
+            <w:r>
+              <w:rPr>
+                <w:rFonts w:ascii="맑은 고딕" w:cs="맑은 고딕" w:eastAsia="맑은 고딕" w:hAnsi="맑은 고딕"/>
+                <w:b/>
+                <w:bCs/>
+                <w:sz w:val="19"/>
+                <w:szCs w:val="19"/>
+              </w:rPr>
+              <w:t xml:space="preserve">"반대 의견 없음"</w:t>
+            </w:r>
+            <w:r>
+              <w:rPr>
+                <w:rFonts w:ascii="맑은 고딕" w:cs="맑은 고딕" w:eastAsia="맑은 고딕" w:hAnsi="맑은 고딕"/>
+                <w:sz w:val="19"/>
+                <w:szCs w:val="19"/>
+              </w:rPr>
+              <w:t xml:space="preserve">이라고 적혀 있으나 의견제출인은 가려져 있습니다. 본인은 위 의견 제출에 관하여 </w:t>
+            </w:r>
+            <w:r>
+              <w:rPr>
+                <w:rFonts w:ascii="맑은 고딕" w:cs="맑은 고딕" w:eastAsia="맑은 고딕" w:hAnsi="맑은 고딕"/>
+                <w:b/>
+                <w:bCs/>
+                <w:sz w:val="19"/>
+                <w:szCs w:val="19"/>
+              </w:rPr>
+              <w:t xml:space="preserve">의견을 묻거나 통지받은 사실이 없습니다.</w:t>
+            </w:r>
+            <w:r>
+              <w:rPr>
+                <w:rFonts w:ascii="맑은 고딕" w:cs="맑은 고딕" w:eastAsia="맑은 고딕" w:hAnsi="맑은 고딕"/>
+                <w:sz w:val="19"/>
+                <w:szCs w:val="19"/>
+              </w:rPr>
+              <w:t xml:space="preserve"> 이에 본인은 </w:t>
+            </w:r>
+            <w:r>
+              <w:rPr>
+                <w:rFonts w:ascii="맑은 고딕" w:cs="맑은 고딕" w:eastAsia="맑은 고딕" w:hAnsi="맑은 고딕"/>
+                <w:b/>
+                <w:bCs/>
+                <w:sz w:val="19"/>
+                <w:szCs w:val="19"/>
+              </w:rPr>
+              <w:t xml:space="preserve">당시 횡룡마을 이장 조방용 및 감곡면 환경개선위원회 위원들이 위 "반대 의견 없음" 의견서에 서명한 사실이 있는지, 있다면 누가 어떤 자격으로 서명하였는지 밝혀 줄 것을 요구합니다.</w:t>
+            </w:r>
+            <w:r>
+              <w:rPr>
+                <w:rFonts w:ascii="맑은 고딕" w:cs="맑은 고딕" w:eastAsia="맑은 고딕" w:hAnsi="맑은 고딕"/>
+                <w:sz w:val="19"/>
+                <w:szCs w:val="19"/>
+              </w:rPr>
+              <w:t xml:space="preserve"> 서명한 사실이 있다면, 본인은 그 의견이 횡룡마을 주민의 의견으로 취급되는 것을 추인하지 않습니다.</w:t>
             </w:r>
           </w:p>
           <w:p>
@@ -3324,33 +3475,15 @@
                 <w:sz w:val="19"/>
                 <w:szCs w:val="19"/>
               </w:rPr>
-              <w:t xml:space="preserve">4. (수사의뢰 동참)</w:t>
-            </w:r>
-            <w:r>
-              <w:rPr>
-                <w:rFonts w:ascii="맑은 고딕" w:cs="맑은 고딕" w:eastAsia="맑은 고딕" w:hAnsi="맑은 고딕"/>
-                <w:sz w:val="19"/>
-                <w:szCs w:val="19"/>
-              </w:rPr>
-              <w:t xml:space="preserve"> 본인은 위 금원의 지급 경위와 사용처를 밝히기 위하여 감곡면 횡룡마을 주민 박상남이 정읍경찰서에 제출하는 </w:t>
-            </w:r>
-            <w:r>
-              <w:rPr>
-                <w:rFonts w:ascii="맑은 고딕" w:cs="맑은 고딕" w:eastAsia="맑은 고딕" w:hAnsi="맑은 고딕"/>
-                <w:b/>
-                <w:bCs/>
-                <w:sz w:val="19"/>
-                <w:szCs w:val="19"/>
-              </w:rPr>
-              <w:t xml:space="preserve">수사의뢰 진정에 동참</w:t>
-            </w:r>
-            <w:r>
-              <w:rPr>
-                <w:rFonts w:ascii="맑은 고딕" w:cs="맑은 고딕" w:eastAsia="맑은 고딕" w:hAnsi="맑은 고딕"/>
-                <w:sz w:val="19"/>
-                <w:szCs w:val="19"/>
-              </w:rPr>
-              <w:t xml:space="preserve">하며, 이 서명부가 그 첨부자료로 제출되는 데 동의합니다. 이 서명은 특정인의 범죄를 단정하는 것이 아니라 사실 확인을 요청하는 것입니다.</w:t>
+              <w:t xml:space="preserve">4. (자료 공개 요구)</w:t>
+            </w:r>
+            <w:r>
+              <w:rPr>
+                <w:rFonts w:ascii="맑은 고딕" w:cs="맑은 고딕" w:eastAsia="맑은 고딕" w:hAnsi="맑은 고딕"/>
+                <w:sz w:val="19"/>
+                <w:szCs w:val="19"/>
+              </w:rPr>
+              <w:t xml:space="preserve"> 본인은 감곡면 환경개선위원회와 순정축산업협동조합에 다음 자료의 공개와 보고를 요구합니다. ① 1억 원(및 그 밖의 지원금)의 지급 결의, 지급일, 수령 계좌 명의 ② 위원회의 금원 사용 내역과 증빙, 현재 잔액 ③ 위원회 규약, 위원 명단, 제1차부터 그 이후의 회의록 ④ 순정축협이 약속한 분기별 검사자료 ⑤ 2023. 7. 20. 주민의견서의 제출인과 제출 경위 (개인 계좌번호·연락처 등은 가리고 공개하여도 됩니다.)</w:t>
             </w:r>
           </w:p>
           <w:p>
@@ -3367,15 +3500,33 @@
                 <w:sz w:val="19"/>
                 <w:szCs w:val="19"/>
               </w:rPr>
-              <w:t xml:space="preserve">5. (연락·제출 위임)</w:t>
-            </w:r>
-            <w:r>
-              <w:rPr>
-                <w:rFonts w:ascii="맑은 고딕" w:cs="맑은 고딕" w:eastAsia="맑은 고딕" w:hAnsi="맑은 고딕"/>
-                <w:sz w:val="19"/>
-                <w:szCs w:val="19"/>
-              </w:rPr>
-              <w:t xml:space="preserve"> 본인은 위 3·4항의 요구와 진정 동참에 필요한 연락, 서명부 제출, 관계기관 민원 제기를 서명 수합 책임자 박상남에게 맡깁니다.</w:t>
+              <w:t xml:space="preserve">5. (수사의뢰 동참)</w:t>
+            </w:r>
+            <w:r>
+              <w:rPr>
+                <w:rFonts w:ascii="맑은 고딕" w:cs="맑은 고딕" w:eastAsia="맑은 고딕" w:hAnsi="맑은 고딕"/>
+                <w:sz w:val="19"/>
+                <w:szCs w:val="19"/>
+              </w:rPr>
+              <w:t xml:space="preserve"> 본인은 위 금원의 지급 경위와 사용처를 밝히기 위하여 감곡면 횡룡마을 주민 박상남이 정읍경찰서에 제출하는 </w:t>
+            </w:r>
+            <w:r>
+              <w:rPr>
+                <w:rFonts w:ascii="맑은 고딕" w:cs="맑은 고딕" w:eastAsia="맑은 고딕" w:hAnsi="맑은 고딕"/>
+                <w:b/>
+                <w:bCs/>
+                <w:sz w:val="19"/>
+                <w:szCs w:val="19"/>
+              </w:rPr>
+              <w:t xml:space="preserve">수사의뢰 진정에 동참</w:t>
+            </w:r>
+            <w:r>
+              <w:rPr>
+                <w:rFonts w:ascii="맑은 고딕" w:cs="맑은 고딕" w:eastAsia="맑은 고딕" w:hAnsi="맑은 고딕"/>
+                <w:sz w:val="19"/>
+                <w:szCs w:val="19"/>
+              </w:rPr>
+              <w:t xml:space="preserve">하며, 이 서명부가 그 첨부자료로 제출되는 데 동의합니다. 이 서명은 특정인의 범죄를 단정하는 것이 아니라 사실 확인을 요청하는 것입니다.</w:t>
             </w:r>
           </w:p>
           <w:p>
@@ -3392,33 +3543,15 @@
                 <w:sz w:val="19"/>
                 <w:szCs w:val="19"/>
               </w:rPr>
-              <w:t xml:space="preserve">6. (향후 원칙)</w:t>
-            </w:r>
-            <w:r>
-              <w:rPr>
-                <w:rFonts w:ascii="맑은 고딕" w:cs="맑은 고딕" w:eastAsia="맑은 고딕" w:hAnsi="맑은 고딕"/>
-                <w:sz w:val="19"/>
-                <w:szCs w:val="19"/>
-              </w:rPr>
-              <w:t xml:space="preserve"> 본인은 앞으로 횡룡마을의 이름으로 외부 단체·사업자와 협약을 맺거나, 행정기관에 마을 의견을 제출하거나, 금원을 받는 경우에는 </w:t>
-            </w:r>
-            <w:r>
-              <w:rPr>
-                <w:rFonts w:ascii="맑은 고딕" w:cs="맑은 고딕" w:eastAsia="맑은 고딕" w:hAnsi="맑은 고딕"/>
-                <w:b/>
-                <w:bCs/>
-                <w:sz w:val="19"/>
-                <w:szCs w:val="19"/>
-              </w:rPr>
-              <w:t xml:space="preserve">반드시 사전에 마을총회의 결의</w:t>
-            </w:r>
-            <w:r>
-              <w:rPr>
-                <w:rFonts w:ascii="맑은 고딕" w:cs="맑은 고딕" w:eastAsia="맑은 고딕" w:hAnsi="맑은 고딕"/>
-                <w:sz w:val="19"/>
-                <w:szCs w:val="19"/>
-              </w:rPr>
-              <w:t xml:space="preserve">를 거쳐야 한다고 봅니다. 감곡면 환경개선위원회는 그러한 결의가 있기 전까지 본인을 포함한 횡룡마을 주민 전체를 대표하지 않습니다.</w:t>
+              <w:t xml:space="preserve">6. (연락·제출 위임)</w:t>
+            </w:r>
+            <w:r>
+              <w:rPr>
+                <w:rFonts w:ascii="맑은 고딕" w:cs="맑은 고딕" w:eastAsia="맑은 고딕" w:hAnsi="맑은 고딕"/>
+                <w:sz w:val="19"/>
+                <w:szCs w:val="19"/>
+              </w:rPr>
+              <w:t xml:space="preserve"> 본인은 위 3~5항의 요구와 진정 동참에 필요한 연락, 서명부 제출, 관계기관 민원 제기를 서명 수합 책임자 박상남에게 맡깁니다.</w:t>
             </w:r>
           </w:p>
           <w:p>
@@ -3435,7 +3568,50 @@
                 <w:sz w:val="19"/>
                 <w:szCs w:val="19"/>
               </w:rPr>
-              <w:t xml:space="preserve">7. (사본 송부 동의)</w:t>
+              <w:t xml:space="preserve">7. (향후 원칙)</w:t>
+            </w:r>
+            <w:r>
+              <w:rPr>
+                <w:rFonts w:ascii="맑은 고딕" w:cs="맑은 고딕" w:eastAsia="맑은 고딕" w:hAnsi="맑은 고딕"/>
+                <w:sz w:val="19"/>
+                <w:szCs w:val="19"/>
+              </w:rPr>
+              <w:t xml:space="preserve"> 본인은 앞으로 횡룡마을의 이름으로 외부 단체·사업자와 협약을 맺거나, 행정기관에 마을 의견을 제출하거나, 금원을 받는 경우에는 </w:t>
+            </w:r>
+            <w:r>
+              <w:rPr>
+                <w:rFonts w:ascii="맑은 고딕" w:cs="맑은 고딕" w:eastAsia="맑은 고딕" w:hAnsi="맑은 고딕"/>
+                <w:b/>
+                <w:bCs/>
+                <w:sz w:val="19"/>
+                <w:szCs w:val="19"/>
+              </w:rPr>
+              <w:t xml:space="preserve">반드시 사전에 마을총회의 결의</w:t>
+            </w:r>
+            <w:r>
+              <w:rPr>
+                <w:rFonts w:ascii="맑은 고딕" w:cs="맑은 고딕" w:eastAsia="맑은 고딕" w:hAnsi="맑은 고딕"/>
+                <w:sz w:val="19"/>
+                <w:szCs w:val="19"/>
+              </w:rPr>
+              <w:t xml:space="preserve">를 거쳐야 한다고 봅니다. 감곡면 환경개선위원회는 그러한 결의가 있기 전까지 본인을 포함한 횡룡마을 주민 전체를 대표하지 않습니다.</w:t>
+            </w:r>
+          </w:p>
+          <w:p>
+            <w:pPr>
+              <w:spacing w:after="40" w:before="0" w:line="280"/>
+              <w:ind w:left="340" w:hanging="340"/>
+              <w:jc w:val="both"/>
+            </w:pPr>
+            <w:r>
+              <w:rPr>
+                <w:rFonts w:ascii="맑은 고딕" w:cs="맑은 고딕" w:eastAsia="맑은 고딕" w:hAnsi="맑은 고딕"/>
+                <w:b/>
+                <w:bCs/>
+                <w:sz w:val="19"/>
+                <w:szCs w:val="19"/>
+              </w:rPr>
+              <w:t xml:space="preserve">8. (사본 송부 동의)</w:t>
             </w:r>
             <w:r>
               <w:rPr>
@@ -3524,7 +3700,7 @@
                 <w:sz w:val="17"/>
                 <w:szCs w:val="17"/>
               </w:rPr>
-              <w:t xml:space="preserve"> 본인은 앞쪽 1~7항에 동의합니다: ① 2023. 1. 30. 공동협약에 당시 횡룡마을 이장 조방용이(가) 서명할 때 마을총회 결의나 본인의 위임을 알지 못하고 참여·통지받은 사실이 없음 ② 이장·위원회가 횡룡마을 주민을 대표하여 한 협약 체결, 1억 원 등 금원 수령·사용, 퇴비사 신축 "반대 의견 없음" 의견 제출 등을 </w:t>
+              <w:t xml:space="preserve"> 본인은 앞쪽 1~8항에 동의합니다: ① 2023. 1. 30. 공동협약에 당시 횡룡마을 이장 조방용이(가) 서명할 때 마을총회 결의나 본인의 위임을 알지 못하고 참여·통지받은 사실이 없음 ② 이장·위원회가 횡룡마을 주민을 대표하여 한 협약 체결, 1억 원 등 금원 수령·사용 등을 </w:t>
             </w:r>
             <w:r>
               <w:rPr>
@@ -3542,7 +3718,7 @@
                 <w:sz w:val="17"/>
                 <w:szCs w:val="17"/>
               </w:rPr>
-              <w:t xml:space="preserve"> ③ 위원회·순정축협에 자료 공개·보고 요구 ④ </w:t>
+              <w:t xml:space="preserve"> ③ </w:t>
             </w:r>
             <w:r>
               <w:rPr>
@@ -3552,7 +3728,7 @@
                 <w:sz w:val="17"/>
                 <w:szCs w:val="17"/>
               </w:rPr>
-              <w:t xml:space="preserve">수사의뢰 진정 동참</w:t>
+              <w:t xml:space="preserve">퇴비사 신축 "반대 의견 없음" 의견서에 이장·위원회가 서명한 사실이 있는지 밝힐 것을 요구</w:t>
             </w:r>
             <w:r>
               <w:rPr>
@@ -3560,7 +3736,25 @@
                 <w:sz w:val="17"/>
                 <w:szCs w:val="17"/>
               </w:rPr>
-              <w:t xml:space="preserve"> ⑤ 연락·제출을 박상남에게 맡김 ⑥ 마을 이름의 대표 행위는 마을총회 결의 필요 ⑦ 사본 송부·원본 제출과 개인정보 이용에 동의</w:t>
+              <w:t xml:space="preserve">(서명했다면 주민 의견으로 추인하지 않음) ④ 위원회·순정축협에 자료 공개·보고 요구 ⑤ </w:t>
+            </w:r>
+            <w:r>
+              <w:rPr>
+                <w:rFonts w:ascii="맑은 고딕" w:cs="맑은 고딕" w:eastAsia="맑은 고딕" w:hAnsi="맑은 고딕"/>
+                <w:b/>
+                <w:bCs/>
+                <w:sz w:val="17"/>
+                <w:szCs w:val="17"/>
+              </w:rPr>
+              <w:t xml:space="preserve">수사의뢰 진정 동참</w:t>
+            </w:r>
+            <w:r>
+              <w:rPr>
+                <w:rFonts w:ascii="맑은 고딕" w:cs="맑은 고딕" w:eastAsia="맑은 고딕" w:hAnsi="맑은 고딕"/>
+                <w:sz w:val="17"/>
+                <w:szCs w:val="17"/>
+              </w:rPr>
+              <w:t xml:space="preserve"> ⑥ 연락·제출을 박상남에게 맡김 ⑦ 마을 이름의 대표 행위는 마을총회 결의 필요 ⑧ 사본 송부·원본 제출과 개인정보 이용에 동의</w:t>
             </w:r>
           </w:p>
         </w:tc>
@@ -6104,7 +6298,7 @@
                 <w:sz w:val="19"/>
                 <w:szCs w:val="19"/>
               </w:rPr>
-              <w:t xml:space="preserve"> ① 2023. 1. 30. 공동협약 체결 ② 순정축협으로부터의 금원(운영비 후원·환경개선사업비 등, 순정축협이 밝힌 1억 원 포함) 수령과 그 사용 결정 ③ 2023. 7. 20. 순정축협 퇴비사 997.5㎡(약 300평) 신축에 관한 "반대 의견 없음" 의견 중 본 마을 명의로 이루어진 부분 ④ 2023. 5. 2. 위원회 회의에서 마을 이장을 위원회 법인 임원으로 정한 결의 중 본 마을 대표 자격에 관한 부분. 이 서명은 본인이 개별적으로 가지는 손해배상청구권 등 권리를 포기하는 것이 아닙니다.</w:t>
+              <w:t xml:space="preserve"> ① 2023. 1. 30. 공동협약 체결 ② 순정축협으로부터의 금원(운영비 후원·환경개선사업비 등, 순정축협이 밝힌 1억 원 포함) 수령과 그 사용 결정 ③ 2023. 5. 2. 위원회 회의에서 마을 이장을 위원회 법인 임원으로 정한 결의 중 본 마을 대표 자격에 관한 부분. 이 서명은 본인이 개별적으로 가지는 손해배상청구권 등 권리를 포기하는 것이 아닙니다.</w:t>
             </w:r>
           </w:p>
           <w:p>
@@ -6121,15 +6315,69 @@
                 <w:sz w:val="19"/>
                 <w:szCs w:val="19"/>
               </w:rPr>
-              <w:t xml:space="preserve">3. (자료 공개 요구)</w:t>
-            </w:r>
-            <w:r>
-              <w:rPr>
-                <w:rFonts w:ascii="맑은 고딕" w:cs="맑은 고딕" w:eastAsia="맑은 고딕" w:hAnsi="맑은 고딕"/>
-                <w:sz w:val="19"/>
-                <w:szCs w:val="19"/>
-              </w:rPr>
-              <w:t xml:space="preserve"> 본인은 감곡면 환경개선위원회와 순정축산업협동조합에 다음 자료의 공개와 보고를 요구합니다. ① 1억 원(및 그 밖의 지원금)의 지급 결의, 지급일, 수령 계좌 명의 ② 위원회의 금원 사용 내역과 증빙, 현재 잔액 ③ 위원회 규약, 위원 명단, 제1차부터 그 이후의 회의록 ④ 순정축협이 약속한 분기별 검사자료 ⑤ 2023. 7. 20. 주민의견서의 제출인과 제출 경위 (개인 계좌번호·연락처 등은 가리고 공개하여도 됩니다.)</w:t>
+              <w:t xml:space="preserve">3. ("반대 의견 없음" 서명 확인)</w:t>
+            </w:r>
+            <w:r>
+              <w:rPr>
+                <w:rFonts w:ascii="맑은 고딕" w:cs="맑은 고딕" w:eastAsia="맑은 고딕" w:hAnsi="맑은 고딕"/>
+                <w:sz w:val="19"/>
+                <w:szCs w:val="19"/>
+              </w:rPr>
+              <w:t xml:space="preserve"> 순정축협이 2023. 5. 3. 신축허가를 신청한 퇴비사 997.5㎡(약 300평)에 관하여, 감곡면장이 2023. 7. 21. 정읍시에 제출한 2023. 7. 20.자 주민의견서에는 </w:t>
+            </w:r>
+            <w:r>
+              <w:rPr>
+                <w:rFonts w:ascii="맑은 고딕" w:cs="맑은 고딕" w:eastAsia="맑은 고딕" w:hAnsi="맑은 고딕"/>
+                <w:b/>
+                <w:bCs/>
+                <w:sz w:val="19"/>
+                <w:szCs w:val="19"/>
+              </w:rPr>
+              <w:t xml:space="preserve">"반대 의견 없음"</w:t>
+            </w:r>
+            <w:r>
+              <w:rPr>
+                <w:rFonts w:ascii="맑은 고딕" w:cs="맑은 고딕" w:eastAsia="맑은 고딕" w:hAnsi="맑은 고딕"/>
+                <w:sz w:val="19"/>
+                <w:szCs w:val="19"/>
+              </w:rPr>
+              <w:t xml:space="preserve">이라고 적혀 있으나 의견제출인은 가려져 있습니다. 본인은 위 의견 제출에 관하여 </w:t>
+            </w:r>
+            <w:r>
+              <w:rPr>
+                <w:rFonts w:ascii="맑은 고딕" w:cs="맑은 고딕" w:eastAsia="맑은 고딕" w:hAnsi="맑은 고딕"/>
+                <w:b/>
+                <w:bCs/>
+                <w:sz w:val="19"/>
+                <w:szCs w:val="19"/>
+              </w:rPr>
+              <w:t xml:space="preserve">의견을 묻거나 통지받은 사실이 없습니다.</w:t>
+            </w:r>
+            <w:r>
+              <w:rPr>
+                <w:rFonts w:ascii="맑은 고딕" w:cs="맑은 고딕" w:eastAsia="맑은 고딕" w:hAnsi="맑은 고딕"/>
+                <w:sz w:val="19"/>
+                <w:szCs w:val="19"/>
+              </w:rPr>
+              <w:t xml:space="preserve"> 이에 본인은 </w:t>
+            </w:r>
+            <w:r>
+              <w:rPr>
+                <w:rFonts w:ascii="맑은 고딕" w:cs="맑은 고딕" w:eastAsia="맑은 고딕" w:hAnsi="맑은 고딕"/>
+                <w:b/>
+                <w:bCs/>
+                <w:sz w:val="19"/>
+                <w:szCs w:val="19"/>
+              </w:rPr>
+              <w:t xml:space="preserve">당시 진농마을 이장 이근노 및 감곡면 환경개선위원회 위원들이 위 "반대 의견 없음" 의견서에 서명한 사실이 있는지, 있다면 누가 어떤 자격으로 서명하였는지 밝혀 줄 것을 요구합니다.</w:t>
+            </w:r>
+            <w:r>
+              <w:rPr>
+                <w:rFonts w:ascii="맑은 고딕" w:cs="맑은 고딕" w:eastAsia="맑은 고딕" w:hAnsi="맑은 고딕"/>
+                <w:sz w:val="19"/>
+                <w:szCs w:val="19"/>
+              </w:rPr>
+              <w:t xml:space="preserve"> 서명한 사실이 있다면, 본인은 그 의견이 진농마을 주민의 의견으로 취급되는 것을 추인하지 않습니다.</w:t>
             </w:r>
           </w:p>
           <w:p>
@@ -6146,33 +6394,15 @@
                 <w:sz w:val="19"/>
                 <w:szCs w:val="19"/>
               </w:rPr>
-              <w:t xml:space="preserve">4. (수사의뢰 동참)</w:t>
-            </w:r>
-            <w:r>
-              <w:rPr>
-                <w:rFonts w:ascii="맑은 고딕" w:cs="맑은 고딕" w:eastAsia="맑은 고딕" w:hAnsi="맑은 고딕"/>
-                <w:sz w:val="19"/>
-                <w:szCs w:val="19"/>
-              </w:rPr>
-              <w:t xml:space="preserve"> 본인은 위 금원의 지급 경위와 사용처를 밝히기 위하여 감곡면 횡룡마을 주민 박상남이 정읍경찰서에 제출하는 </w:t>
-            </w:r>
-            <w:r>
-              <w:rPr>
-                <w:rFonts w:ascii="맑은 고딕" w:cs="맑은 고딕" w:eastAsia="맑은 고딕" w:hAnsi="맑은 고딕"/>
-                <w:b/>
-                <w:bCs/>
-                <w:sz w:val="19"/>
-                <w:szCs w:val="19"/>
-              </w:rPr>
-              <w:t xml:space="preserve">수사의뢰 진정에 동참</w:t>
-            </w:r>
-            <w:r>
-              <w:rPr>
-                <w:rFonts w:ascii="맑은 고딕" w:cs="맑은 고딕" w:eastAsia="맑은 고딕" w:hAnsi="맑은 고딕"/>
-                <w:sz w:val="19"/>
-                <w:szCs w:val="19"/>
-              </w:rPr>
-              <w:t xml:space="preserve">하며, 이 서명부가 그 첨부자료로 제출되는 데 동의합니다. 이 서명은 특정인의 범죄를 단정하는 것이 아니라 사실 확인을 요청하는 것입니다.</w:t>
+              <w:t xml:space="preserve">4. (자료 공개 요구)</w:t>
+            </w:r>
+            <w:r>
+              <w:rPr>
+                <w:rFonts w:ascii="맑은 고딕" w:cs="맑은 고딕" w:eastAsia="맑은 고딕" w:hAnsi="맑은 고딕"/>
+                <w:sz w:val="19"/>
+                <w:szCs w:val="19"/>
+              </w:rPr>
+              <w:t xml:space="preserve"> 본인은 감곡면 환경개선위원회와 순정축산업협동조합에 다음 자료의 공개와 보고를 요구합니다. ① 1억 원(및 그 밖의 지원금)의 지급 결의, 지급일, 수령 계좌 명의 ② 위원회의 금원 사용 내역과 증빙, 현재 잔액 ③ 위원회 규약, 위원 명단, 제1차부터 그 이후의 회의록 ④ 순정축협이 약속한 분기별 검사자료 ⑤ 2023. 7. 20. 주민의견서의 제출인과 제출 경위 (개인 계좌번호·연락처 등은 가리고 공개하여도 됩니다.)</w:t>
             </w:r>
           </w:p>
           <w:p>
@@ -6189,15 +6419,33 @@
                 <w:sz w:val="19"/>
                 <w:szCs w:val="19"/>
               </w:rPr>
-              <w:t xml:space="preserve">5. (연락·제출 위임)</w:t>
-            </w:r>
-            <w:r>
-              <w:rPr>
-                <w:rFonts w:ascii="맑은 고딕" w:cs="맑은 고딕" w:eastAsia="맑은 고딕" w:hAnsi="맑은 고딕"/>
-                <w:sz w:val="19"/>
-                <w:szCs w:val="19"/>
-              </w:rPr>
-              <w:t xml:space="preserve"> 본인은 위 3·4항의 요구와 진정 동참에 필요한 연락, 서명부 제출, 관계기관 민원 제기를 서명 수합 책임자 박상남에게 맡깁니다.</w:t>
+              <w:t xml:space="preserve">5. (수사의뢰 동참)</w:t>
+            </w:r>
+            <w:r>
+              <w:rPr>
+                <w:rFonts w:ascii="맑은 고딕" w:cs="맑은 고딕" w:eastAsia="맑은 고딕" w:hAnsi="맑은 고딕"/>
+                <w:sz w:val="19"/>
+                <w:szCs w:val="19"/>
+              </w:rPr>
+              <w:t xml:space="preserve"> 본인은 위 금원의 지급 경위와 사용처를 밝히기 위하여 감곡면 횡룡마을 주민 박상남이 정읍경찰서에 제출하는 </w:t>
+            </w:r>
+            <w:r>
+              <w:rPr>
+                <w:rFonts w:ascii="맑은 고딕" w:cs="맑은 고딕" w:eastAsia="맑은 고딕" w:hAnsi="맑은 고딕"/>
+                <w:b/>
+                <w:bCs/>
+                <w:sz w:val="19"/>
+                <w:szCs w:val="19"/>
+              </w:rPr>
+              <w:t xml:space="preserve">수사의뢰 진정에 동참</w:t>
+            </w:r>
+            <w:r>
+              <w:rPr>
+                <w:rFonts w:ascii="맑은 고딕" w:cs="맑은 고딕" w:eastAsia="맑은 고딕" w:hAnsi="맑은 고딕"/>
+                <w:sz w:val="19"/>
+                <w:szCs w:val="19"/>
+              </w:rPr>
+              <w:t xml:space="preserve">하며, 이 서명부가 그 첨부자료로 제출되는 데 동의합니다. 이 서명은 특정인의 범죄를 단정하는 것이 아니라 사실 확인을 요청하는 것입니다.</w:t>
             </w:r>
           </w:p>
           <w:p>
@@ -6214,33 +6462,15 @@
                 <w:sz w:val="19"/>
                 <w:szCs w:val="19"/>
               </w:rPr>
-              <w:t xml:space="preserve">6. (향후 원칙)</w:t>
-            </w:r>
-            <w:r>
-              <w:rPr>
-                <w:rFonts w:ascii="맑은 고딕" w:cs="맑은 고딕" w:eastAsia="맑은 고딕" w:hAnsi="맑은 고딕"/>
-                <w:sz w:val="19"/>
-                <w:szCs w:val="19"/>
-              </w:rPr>
-              <w:t xml:space="preserve"> 본인은 앞으로 진농마을의 이름으로 외부 단체·사업자와 협약을 맺거나, 행정기관에 마을 의견을 제출하거나, 금원을 받는 경우에는 </w:t>
-            </w:r>
-            <w:r>
-              <w:rPr>
-                <w:rFonts w:ascii="맑은 고딕" w:cs="맑은 고딕" w:eastAsia="맑은 고딕" w:hAnsi="맑은 고딕"/>
-                <w:b/>
-                <w:bCs/>
-                <w:sz w:val="19"/>
-                <w:szCs w:val="19"/>
-              </w:rPr>
-              <w:t xml:space="preserve">반드시 사전에 마을총회의 결의</w:t>
-            </w:r>
-            <w:r>
-              <w:rPr>
-                <w:rFonts w:ascii="맑은 고딕" w:cs="맑은 고딕" w:eastAsia="맑은 고딕" w:hAnsi="맑은 고딕"/>
-                <w:sz w:val="19"/>
-                <w:szCs w:val="19"/>
-              </w:rPr>
-              <w:t xml:space="preserve">를 거쳐야 한다고 봅니다. 감곡면 환경개선위원회는 그러한 결의가 있기 전까지 본인을 포함한 진농마을 주민 전체를 대표하지 않습니다.</w:t>
+              <w:t xml:space="preserve">6. (연락·제출 위임)</w:t>
+            </w:r>
+            <w:r>
+              <w:rPr>
+                <w:rFonts w:ascii="맑은 고딕" w:cs="맑은 고딕" w:eastAsia="맑은 고딕" w:hAnsi="맑은 고딕"/>
+                <w:sz w:val="19"/>
+                <w:szCs w:val="19"/>
+              </w:rPr>
+              <w:t xml:space="preserve"> 본인은 위 3~5항의 요구와 진정 동참에 필요한 연락, 서명부 제출, 관계기관 민원 제기를 서명 수합 책임자 박상남에게 맡깁니다.</w:t>
             </w:r>
           </w:p>
           <w:p>
@@ -6257,7 +6487,50 @@
                 <w:sz w:val="19"/>
                 <w:szCs w:val="19"/>
               </w:rPr>
-              <w:t xml:space="preserve">7. (사본 송부 동의)</w:t>
+              <w:t xml:space="preserve">7. (향후 원칙)</w:t>
+            </w:r>
+            <w:r>
+              <w:rPr>
+                <w:rFonts w:ascii="맑은 고딕" w:cs="맑은 고딕" w:eastAsia="맑은 고딕" w:hAnsi="맑은 고딕"/>
+                <w:sz w:val="19"/>
+                <w:szCs w:val="19"/>
+              </w:rPr>
+              <w:t xml:space="preserve"> 본인은 앞으로 진농마을의 이름으로 외부 단체·사업자와 협약을 맺거나, 행정기관에 마을 의견을 제출하거나, 금원을 받는 경우에는 </w:t>
+            </w:r>
+            <w:r>
+              <w:rPr>
+                <w:rFonts w:ascii="맑은 고딕" w:cs="맑은 고딕" w:eastAsia="맑은 고딕" w:hAnsi="맑은 고딕"/>
+                <w:b/>
+                <w:bCs/>
+                <w:sz w:val="19"/>
+                <w:szCs w:val="19"/>
+              </w:rPr>
+              <w:t xml:space="preserve">반드시 사전에 마을총회의 결의</w:t>
+            </w:r>
+            <w:r>
+              <w:rPr>
+                <w:rFonts w:ascii="맑은 고딕" w:cs="맑은 고딕" w:eastAsia="맑은 고딕" w:hAnsi="맑은 고딕"/>
+                <w:sz w:val="19"/>
+                <w:szCs w:val="19"/>
+              </w:rPr>
+              <w:t xml:space="preserve">를 거쳐야 한다고 봅니다. 감곡면 환경개선위원회는 그러한 결의가 있기 전까지 본인을 포함한 진농마을 주민 전체를 대표하지 않습니다.</w:t>
+            </w:r>
+          </w:p>
+          <w:p>
+            <w:pPr>
+              <w:spacing w:after="40" w:before="0" w:line="280"/>
+              <w:ind w:left="340" w:hanging="340"/>
+              <w:jc w:val="both"/>
+            </w:pPr>
+            <w:r>
+              <w:rPr>
+                <w:rFonts w:ascii="맑은 고딕" w:cs="맑은 고딕" w:eastAsia="맑은 고딕" w:hAnsi="맑은 고딕"/>
+                <w:b/>
+                <w:bCs/>
+                <w:sz w:val="19"/>
+                <w:szCs w:val="19"/>
+              </w:rPr>
+              <w:t xml:space="preserve">8. (사본 송부 동의)</w:t>
             </w:r>
             <w:r>
               <w:rPr>
@@ -6346,7 +6619,7 @@
                 <w:sz w:val="17"/>
                 <w:szCs w:val="17"/>
               </w:rPr>
-              <w:t xml:space="preserve"> 본인은 앞쪽 1~7항에 동의합니다: ① 2023. 1. 30. 공동협약에 당시 진농마을 이장 이근노이(가) 서명할 때 마을총회 결의나 본인의 위임을 알지 못하고 참여·통지받은 사실이 없음 ② 이장·위원회가 진농마을 주민을 대표하여 한 협약 체결, 1억 원 등 금원 수령·사용, 퇴비사 신축 "반대 의견 없음" 의견 제출 등을 </w:t>
+              <w:t xml:space="preserve"> 본인은 앞쪽 1~8항에 동의합니다: ① 2023. 1. 30. 공동협약에 당시 진농마을 이장 이근노이(가) 서명할 때 마을총회 결의나 본인의 위임을 알지 못하고 참여·통지받은 사실이 없음 ② 이장·위원회가 진농마을 주민을 대표하여 한 협약 체결, 1억 원 등 금원 수령·사용 등을 </w:t>
             </w:r>
             <w:r>
               <w:rPr>
@@ -6364,7 +6637,7 @@
                 <w:sz w:val="17"/>
                 <w:szCs w:val="17"/>
               </w:rPr>
-              <w:t xml:space="preserve"> ③ 위원회·순정축협에 자료 공개·보고 요구 ④ </w:t>
+              <w:t xml:space="preserve"> ③ </w:t>
             </w:r>
             <w:r>
               <w:rPr>
@@ -6374,7 +6647,7 @@
                 <w:sz w:val="17"/>
                 <w:szCs w:val="17"/>
               </w:rPr>
-              <w:t xml:space="preserve">수사의뢰 진정 동참</w:t>
+              <w:t xml:space="preserve">퇴비사 신축 "반대 의견 없음" 의견서에 이장·위원회가 서명한 사실이 있는지 밝힐 것을 요구</w:t>
             </w:r>
             <w:r>
               <w:rPr>
@@ -6382,7 +6655,25 @@
                 <w:sz w:val="17"/>
                 <w:szCs w:val="17"/>
               </w:rPr>
-              <w:t xml:space="preserve"> ⑤ 연락·제출을 박상남에게 맡김 ⑥ 마을 이름의 대표 행위는 마을총회 결의 필요 ⑦ 사본 송부·원본 제출과 개인정보 이용에 동의</w:t>
+              <w:t xml:space="preserve">(서명했다면 주민 의견으로 추인하지 않음) ④ 위원회·순정축협에 자료 공개·보고 요구 ⑤ </w:t>
+            </w:r>
+            <w:r>
+              <w:rPr>
+                <w:rFonts w:ascii="맑은 고딕" w:cs="맑은 고딕" w:eastAsia="맑은 고딕" w:hAnsi="맑은 고딕"/>
+                <w:b/>
+                <w:bCs/>
+                <w:sz w:val="17"/>
+                <w:szCs w:val="17"/>
+              </w:rPr>
+              <w:t xml:space="preserve">수사의뢰 진정 동참</w:t>
+            </w:r>
+            <w:r>
+              <w:rPr>
+                <w:rFonts w:ascii="맑은 고딕" w:cs="맑은 고딕" w:eastAsia="맑은 고딕" w:hAnsi="맑은 고딕"/>
+                <w:sz w:val="17"/>
+                <w:szCs w:val="17"/>
+              </w:rPr>
+              <w:t xml:space="preserve"> ⑥ 연락·제출을 박상남에게 맡김 ⑦ 마을 이름의 대표 행위는 마을총회 결의 필요 ⑧ 사본 송부·원본 제출과 개인정보 이용에 동의</w:t>
             </w:r>
           </w:p>
         </w:tc>
@@ -8926,7 +9217,7 @@
                 <w:sz w:val="19"/>
                 <w:szCs w:val="19"/>
               </w:rPr>
-              <w:t xml:space="preserve"> ① 2023. 1. 30. 공동협약 체결 ② 순정축협으로부터의 금원(운영비 후원·환경개선사업비 등, 순정축협이 밝힌 1억 원 포함) 수령과 그 사용 결정 ③ 2023. 7. 20. 순정축협 퇴비사 997.5㎡(약 300평) 신축에 관한 "반대 의견 없음" 의견 중 본 마을 명의로 이루어진 부분 ④ 2023. 5. 2. 위원회 회의에서 마을 이장을 위원회 법인 임원으로 정한 결의 중 본 마을 대표 자격에 관한 부분. 이 서명은 본인이 개별적으로 가지는 손해배상청구권 등 권리를 포기하는 것이 아닙니다.</w:t>
+              <w:t xml:space="preserve"> ① 2023. 1. 30. 공동협약 체결 ② 순정축협으로부터의 금원(운영비 후원·환경개선사업비 등, 순정축협이 밝힌 1억 원 포함) 수령과 그 사용 결정 ③ 2023. 5. 2. 위원회 회의에서 마을 이장을 위원회 법인 임원으로 정한 결의 중 본 마을 대표 자격에 관한 부분. 이 서명은 본인이 개별적으로 가지는 손해배상청구권 등 권리를 포기하는 것이 아닙니다.</w:t>
             </w:r>
           </w:p>
           <w:p>
@@ -8943,15 +9234,69 @@
                 <w:sz w:val="19"/>
                 <w:szCs w:val="19"/>
               </w:rPr>
-              <w:t xml:space="preserve">3. (자료 공개 요구)</w:t>
-            </w:r>
-            <w:r>
-              <w:rPr>
-                <w:rFonts w:ascii="맑은 고딕" w:cs="맑은 고딕" w:eastAsia="맑은 고딕" w:hAnsi="맑은 고딕"/>
-                <w:sz w:val="19"/>
-                <w:szCs w:val="19"/>
-              </w:rPr>
-              <w:t xml:space="preserve"> 본인은 감곡면 환경개선위원회와 순정축산업협동조합에 다음 자료의 공개와 보고를 요구합니다. ① 1억 원(및 그 밖의 지원금)의 지급 결의, 지급일, 수령 계좌 명의 ② 위원회의 금원 사용 내역과 증빙, 현재 잔액 ③ 위원회 규약, 위원 명단, 제1차부터 그 이후의 회의록 ④ 순정축협이 약속한 분기별 검사자료 ⑤ 2023. 7. 20. 주민의견서의 제출인과 제출 경위 (개인 계좌번호·연락처 등은 가리고 공개하여도 됩니다.)</w:t>
+              <w:t xml:space="preserve">3. ("반대 의견 없음" 서명 확인)</w:t>
+            </w:r>
+            <w:r>
+              <w:rPr>
+                <w:rFonts w:ascii="맑은 고딕" w:cs="맑은 고딕" w:eastAsia="맑은 고딕" w:hAnsi="맑은 고딕"/>
+                <w:sz w:val="19"/>
+                <w:szCs w:val="19"/>
+              </w:rPr>
+              <w:t xml:space="preserve"> 순정축협이 2023. 5. 3. 신축허가를 신청한 퇴비사 997.5㎡(약 300평)에 관하여, 감곡면장이 2023. 7. 21. 정읍시에 제출한 2023. 7. 20.자 주민의견서에는 </w:t>
+            </w:r>
+            <w:r>
+              <w:rPr>
+                <w:rFonts w:ascii="맑은 고딕" w:cs="맑은 고딕" w:eastAsia="맑은 고딕" w:hAnsi="맑은 고딕"/>
+                <w:b/>
+                <w:bCs/>
+                <w:sz w:val="19"/>
+                <w:szCs w:val="19"/>
+              </w:rPr>
+              <w:t xml:space="preserve">"반대 의견 없음"</w:t>
+            </w:r>
+            <w:r>
+              <w:rPr>
+                <w:rFonts w:ascii="맑은 고딕" w:cs="맑은 고딕" w:eastAsia="맑은 고딕" w:hAnsi="맑은 고딕"/>
+                <w:sz w:val="19"/>
+                <w:szCs w:val="19"/>
+              </w:rPr>
+              <w:t xml:space="preserve">이라고 적혀 있으나 의견제출인은 가려져 있습니다. 본인은 위 의견 제출에 관하여 </w:t>
+            </w:r>
+            <w:r>
+              <w:rPr>
+                <w:rFonts w:ascii="맑은 고딕" w:cs="맑은 고딕" w:eastAsia="맑은 고딕" w:hAnsi="맑은 고딕"/>
+                <w:b/>
+                <w:bCs/>
+                <w:sz w:val="19"/>
+                <w:szCs w:val="19"/>
+              </w:rPr>
+              <w:t xml:space="preserve">의견을 묻거나 통지받은 사실이 없습니다.</w:t>
+            </w:r>
+            <w:r>
+              <w:rPr>
+                <w:rFonts w:ascii="맑은 고딕" w:cs="맑은 고딕" w:eastAsia="맑은 고딕" w:hAnsi="맑은 고딕"/>
+                <w:sz w:val="19"/>
+                <w:szCs w:val="19"/>
+              </w:rPr>
+              <w:t xml:space="preserve"> 이에 본인은 </w:t>
+            </w:r>
+            <w:r>
+              <w:rPr>
+                <w:rFonts w:ascii="맑은 고딕" w:cs="맑은 고딕" w:eastAsia="맑은 고딕" w:hAnsi="맑은 고딕"/>
+                <w:b/>
+                <w:bCs/>
+                <w:sz w:val="19"/>
+                <w:szCs w:val="19"/>
+              </w:rPr>
+              <w:t xml:space="preserve">당시 원삼마을 이장 김봉식 및 감곡면 환경개선위원회 위원들이 위 "반대 의견 없음" 의견서에 서명한 사실이 있는지, 있다면 누가 어떤 자격으로 서명하였는지 밝혀 줄 것을 요구합니다.</w:t>
+            </w:r>
+            <w:r>
+              <w:rPr>
+                <w:rFonts w:ascii="맑은 고딕" w:cs="맑은 고딕" w:eastAsia="맑은 고딕" w:hAnsi="맑은 고딕"/>
+                <w:sz w:val="19"/>
+                <w:szCs w:val="19"/>
+              </w:rPr>
+              <w:t xml:space="preserve"> 서명한 사실이 있다면, 본인은 그 의견이 원삼마을 주민의 의견으로 취급되는 것을 추인하지 않습니다.</w:t>
             </w:r>
           </w:p>
           <w:p>
@@ -8968,33 +9313,15 @@
                 <w:sz w:val="19"/>
                 <w:szCs w:val="19"/>
               </w:rPr>
-              <w:t xml:space="preserve">4. (수사의뢰 동참)</w:t>
-            </w:r>
-            <w:r>
-              <w:rPr>
-                <w:rFonts w:ascii="맑은 고딕" w:cs="맑은 고딕" w:eastAsia="맑은 고딕" w:hAnsi="맑은 고딕"/>
-                <w:sz w:val="19"/>
-                <w:szCs w:val="19"/>
-              </w:rPr>
-              <w:t xml:space="preserve"> 본인은 위 금원의 지급 경위와 사용처를 밝히기 위하여 감곡면 횡룡마을 주민 박상남이 정읍경찰서에 제출하는 </w:t>
-            </w:r>
-            <w:r>
-              <w:rPr>
-                <w:rFonts w:ascii="맑은 고딕" w:cs="맑은 고딕" w:eastAsia="맑은 고딕" w:hAnsi="맑은 고딕"/>
-                <w:b/>
-                <w:bCs/>
-                <w:sz w:val="19"/>
-                <w:szCs w:val="19"/>
-              </w:rPr>
-              <w:t xml:space="preserve">수사의뢰 진정에 동참</w:t>
-            </w:r>
-            <w:r>
-              <w:rPr>
-                <w:rFonts w:ascii="맑은 고딕" w:cs="맑은 고딕" w:eastAsia="맑은 고딕" w:hAnsi="맑은 고딕"/>
-                <w:sz w:val="19"/>
-                <w:szCs w:val="19"/>
-              </w:rPr>
-              <w:t xml:space="preserve">하며, 이 서명부가 그 첨부자료로 제출되는 데 동의합니다. 이 서명은 특정인의 범죄를 단정하는 것이 아니라 사실 확인을 요청하는 것입니다.</w:t>
+              <w:t xml:space="preserve">4. (자료 공개 요구)</w:t>
+            </w:r>
+            <w:r>
+              <w:rPr>
+                <w:rFonts w:ascii="맑은 고딕" w:cs="맑은 고딕" w:eastAsia="맑은 고딕" w:hAnsi="맑은 고딕"/>
+                <w:sz w:val="19"/>
+                <w:szCs w:val="19"/>
+              </w:rPr>
+              <w:t xml:space="preserve"> 본인은 감곡면 환경개선위원회와 순정축산업협동조합에 다음 자료의 공개와 보고를 요구합니다. ① 1억 원(및 그 밖의 지원금)의 지급 결의, 지급일, 수령 계좌 명의 ② 위원회의 금원 사용 내역과 증빙, 현재 잔액 ③ 위원회 규약, 위원 명단, 제1차부터 그 이후의 회의록 ④ 순정축협이 약속한 분기별 검사자료 ⑤ 2023. 7. 20. 주민의견서의 제출인과 제출 경위 (개인 계좌번호·연락처 등은 가리고 공개하여도 됩니다.)</w:t>
             </w:r>
           </w:p>
           <w:p>
@@ -9011,15 +9338,33 @@
                 <w:sz w:val="19"/>
                 <w:szCs w:val="19"/>
               </w:rPr>
-              <w:t xml:space="preserve">5. (연락·제출 위임)</w:t>
-            </w:r>
-            <w:r>
-              <w:rPr>
-                <w:rFonts w:ascii="맑은 고딕" w:cs="맑은 고딕" w:eastAsia="맑은 고딕" w:hAnsi="맑은 고딕"/>
-                <w:sz w:val="19"/>
-                <w:szCs w:val="19"/>
-              </w:rPr>
-              <w:t xml:space="preserve"> 본인은 위 3·4항의 요구와 진정 동참에 필요한 연락, 서명부 제출, 관계기관 민원 제기를 서명 수합 책임자 박상남에게 맡깁니다.</w:t>
+              <w:t xml:space="preserve">5. (수사의뢰 동참)</w:t>
+            </w:r>
+            <w:r>
+              <w:rPr>
+                <w:rFonts w:ascii="맑은 고딕" w:cs="맑은 고딕" w:eastAsia="맑은 고딕" w:hAnsi="맑은 고딕"/>
+                <w:sz w:val="19"/>
+                <w:szCs w:val="19"/>
+              </w:rPr>
+              <w:t xml:space="preserve"> 본인은 위 금원의 지급 경위와 사용처를 밝히기 위하여 감곡면 횡룡마을 주민 박상남이 정읍경찰서에 제출하는 </w:t>
+            </w:r>
+            <w:r>
+              <w:rPr>
+                <w:rFonts w:ascii="맑은 고딕" w:cs="맑은 고딕" w:eastAsia="맑은 고딕" w:hAnsi="맑은 고딕"/>
+                <w:b/>
+                <w:bCs/>
+                <w:sz w:val="19"/>
+                <w:szCs w:val="19"/>
+              </w:rPr>
+              <w:t xml:space="preserve">수사의뢰 진정에 동참</w:t>
+            </w:r>
+            <w:r>
+              <w:rPr>
+                <w:rFonts w:ascii="맑은 고딕" w:cs="맑은 고딕" w:eastAsia="맑은 고딕" w:hAnsi="맑은 고딕"/>
+                <w:sz w:val="19"/>
+                <w:szCs w:val="19"/>
+              </w:rPr>
+              <w:t xml:space="preserve">하며, 이 서명부가 그 첨부자료로 제출되는 데 동의합니다. 이 서명은 특정인의 범죄를 단정하는 것이 아니라 사실 확인을 요청하는 것입니다.</w:t>
             </w:r>
           </w:p>
           <w:p>
@@ -9036,33 +9381,15 @@
                 <w:sz w:val="19"/>
                 <w:szCs w:val="19"/>
               </w:rPr>
-              <w:t xml:space="preserve">6. (향후 원칙)</w:t>
-            </w:r>
-            <w:r>
-              <w:rPr>
-                <w:rFonts w:ascii="맑은 고딕" w:cs="맑은 고딕" w:eastAsia="맑은 고딕" w:hAnsi="맑은 고딕"/>
-                <w:sz w:val="19"/>
-                <w:szCs w:val="19"/>
-              </w:rPr>
-              <w:t xml:space="preserve"> 본인은 앞으로 원삼마을의 이름으로 외부 단체·사업자와 협약을 맺거나, 행정기관에 마을 의견을 제출하거나, 금원을 받는 경우에는 </w:t>
-            </w:r>
-            <w:r>
-              <w:rPr>
-                <w:rFonts w:ascii="맑은 고딕" w:cs="맑은 고딕" w:eastAsia="맑은 고딕" w:hAnsi="맑은 고딕"/>
-                <w:b/>
-                <w:bCs/>
-                <w:sz w:val="19"/>
-                <w:szCs w:val="19"/>
-              </w:rPr>
-              <w:t xml:space="preserve">반드시 사전에 마을총회의 결의</w:t>
-            </w:r>
-            <w:r>
-              <w:rPr>
-                <w:rFonts w:ascii="맑은 고딕" w:cs="맑은 고딕" w:eastAsia="맑은 고딕" w:hAnsi="맑은 고딕"/>
-                <w:sz w:val="19"/>
-                <w:szCs w:val="19"/>
-              </w:rPr>
-              <w:t xml:space="preserve">를 거쳐야 한다고 봅니다. 감곡면 환경개선위원회는 그러한 결의가 있기 전까지 본인을 포함한 원삼마을 주민 전체를 대표하지 않습니다.</w:t>
+              <w:t xml:space="preserve">6. (연락·제출 위임)</w:t>
+            </w:r>
+            <w:r>
+              <w:rPr>
+                <w:rFonts w:ascii="맑은 고딕" w:cs="맑은 고딕" w:eastAsia="맑은 고딕" w:hAnsi="맑은 고딕"/>
+                <w:sz w:val="19"/>
+                <w:szCs w:val="19"/>
+              </w:rPr>
+              <w:t xml:space="preserve"> 본인은 위 3~5항의 요구와 진정 동참에 필요한 연락, 서명부 제출, 관계기관 민원 제기를 서명 수합 책임자 박상남에게 맡깁니다.</w:t>
             </w:r>
           </w:p>
           <w:p>
@@ -9079,7 +9406,50 @@
                 <w:sz w:val="19"/>
                 <w:szCs w:val="19"/>
               </w:rPr>
-              <w:t xml:space="preserve">7. (사본 송부 동의)</w:t>
+              <w:t xml:space="preserve">7. (향후 원칙)</w:t>
+            </w:r>
+            <w:r>
+              <w:rPr>
+                <w:rFonts w:ascii="맑은 고딕" w:cs="맑은 고딕" w:eastAsia="맑은 고딕" w:hAnsi="맑은 고딕"/>
+                <w:sz w:val="19"/>
+                <w:szCs w:val="19"/>
+              </w:rPr>
+              <w:t xml:space="preserve"> 본인은 앞으로 원삼마을의 이름으로 외부 단체·사업자와 협약을 맺거나, 행정기관에 마을 의견을 제출하거나, 금원을 받는 경우에는 </w:t>
+            </w:r>
+            <w:r>
+              <w:rPr>
+                <w:rFonts w:ascii="맑은 고딕" w:cs="맑은 고딕" w:eastAsia="맑은 고딕" w:hAnsi="맑은 고딕"/>
+                <w:b/>
+                <w:bCs/>
+                <w:sz w:val="19"/>
+                <w:szCs w:val="19"/>
+              </w:rPr>
+              <w:t xml:space="preserve">반드시 사전에 마을총회의 결의</w:t>
+            </w:r>
+            <w:r>
+              <w:rPr>
+                <w:rFonts w:ascii="맑은 고딕" w:cs="맑은 고딕" w:eastAsia="맑은 고딕" w:hAnsi="맑은 고딕"/>
+                <w:sz w:val="19"/>
+                <w:szCs w:val="19"/>
+              </w:rPr>
+              <w:t xml:space="preserve">를 거쳐야 한다고 봅니다. 감곡면 환경개선위원회는 그러한 결의가 있기 전까지 본인을 포함한 원삼마을 주민 전체를 대표하지 않습니다.</w:t>
+            </w:r>
+          </w:p>
+          <w:p>
+            <w:pPr>
+              <w:spacing w:after="40" w:before="0" w:line="280"/>
+              <w:ind w:left="340" w:hanging="340"/>
+              <w:jc w:val="both"/>
+            </w:pPr>
+            <w:r>
+              <w:rPr>
+                <w:rFonts w:ascii="맑은 고딕" w:cs="맑은 고딕" w:eastAsia="맑은 고딕" w:hAnsi="맑은 고딕"/>
+                <w:b/>
+                <w:bCs/>
+                <w:sz w:val="19"/>
+                <w:szCs w:val="19"/>
+              </w:rPr>
+              <w:t xml:space="preserve">8. (사본 송부 동의)</w:t>
             </w:r>
             <w:r>
               <w:rPr>
@@ -9168,7 +9538,7 @@
                 <w:sz w:val="17"/>
                 <w:szCs w:val="17"/>
               </w:rPr>
-              <w:t xml:space="preserve"> 본인은 앞쪽 1~7항에 동의합니다: ① 2023. 1. 30. 공동협약에 당시 원삼마을 이장 김봉식이(가) 서명할 때 마을총회 결의나 본인의 위임을 알지 못하고 참여·통지받은 사실이 없음 ② 이장·위원회가 원삼마을 주민을 대표하여 한 협약 체결, 1억 원 등 금원 수령·사용, 퇴비사 신축 "반대 의견 없음" 의견 제출 등을 </w:t>
+              <w:t xml:space="preserve"> 본인은 앞쪽 1~8항에 동의합니다: ① 2023. 1. 30. 공동협약에 당시 원삼마을 이장 김봉식이(가) 서명할 때 마을총회 결의나 본인의 위임을 알지 못하고 참여·통지받은 사실이 없음 ② 이장·위원회가 원삼마을 주민을 대표하여 한 협약 체결, 1억 원 등 금원 수령·사용 등을 </w:t>
             </w:r>
             <w:r>
               <w:rPr>
@@ -9186,7 +9556,7 @@
                 <w:sz w:val="17"/>
                 <w:szCs w:val="17"/>
               </w:rPr>
-              <w:t xml:space="preserve"> ③ 위원회·순정축협에 자료 공개·보고 요구 ④ </w:t>
+              <w:t xml:space="preserve"> ③ </w:t>
             </w:r>
             <w:r>
               <w:rPr>
@@ -9196,7 +9566,7 @@
                 <w:sz w:val="17"/>
                 <w:szCs w:val="17"/>
               </w:rPr>
-              <w:t xml:space="preserve">수사의뢰 진정 동참</w:t>
+              <w:t xml:space="preserve">퇴비사 신축 "반대 의견 없음" 의견서에 이장·위원회가 서명한 사실이 있는지 밝힐 것을 요구</w:t>
             </w:r>
             <w:r>
               <w:rPr>
@@ -9204,7 +9574,25 @@
                 <w:sz w:val="17"/>
                 <w:szCs w:val="17"/>
               </w:rPr>
-              <w:t xml:space="preserve"> ⑤ 연락·제출을 박상남에게 맡김 ⑥ 마을 이름의 대표 행위는 마을총회 결의 필요 ⑦ 사본 송부·원본 제출과 개인정보 이용에 동의</w:t>
+              <w:t xml:space="preserve">(서명했다면 주민 의견으로 추인하지 않음) ④ 위원회·순정축협에 자료 공개·보고 요구 ⑤ </w:t>
+            </w:r>
+            <w:r>
+              <w:rPr>
+                <w:rFonts w:ascii="맑은 고딕" w:cs="맑은 고딕" w:eastAsia="맑은 고딕" w:hAnsi="맑은 고딕"/>
+                <w:b/>
+                <w:bCs/>
+                <w:sz w:val="17"/>
+                <w:szCs w:val="17"/>
+              </w:rPr>
+              <w:t xml:space="preserve">수사의뢰 진정 동참</w:t>
+            </w:r>
+            <w:r>
+              <w:rPr>
+                <w:rFonts w:ascii="맑은 고딕" w:cs="맑은 고딕" w:eastAsia="맑은 고딕" w:hAnsi="맑은 고딕"/>
+                <w:sz w:val="17"/>
+                <w:szCs w:val="17"/>
+              </w:rPr>
+              <w:t xml:space="preserve"> ⑥ 연락·제출을 박상남에게 맡김 ⑦ 마을 이름의 대표 행위는 마을총회 결의 필요 ⑧ 사본 송부·원본 제출과 개인정보 이용에 동의</w:t>
             </w:r>
           </w:p>
         </w:tc>

</xml_diff>